<commit_message>
SEBIA 5 van 15 tot 26 maart en SEBIA 6 sep-dec 2027 gepland; overzicht met drie groepen, naar Educatie
Co-Authored-By: Claude Opus 5.5 <noreply@anthropic.com>
</commit_message>
<xml_diff>
--- a/Educatie/PARADISE_opleidingsplanning.docx
+++ b/Educatie/PARADISE_opleidingsplanning.docx
@@ -3602,7 +3602,7 @@
                 <w:color w:val="1B2630"/>
                 <w:sz w:val="17"/>
               </w:rPr>
-              <w:t>maart</w:t>
+              <w:t>15–26 mrt</w:t>
             </w:r>
           </w:p>
         </w:tc>
@@ -3622,7 +3622,7 @@
                 <w:color w:val="1B2630"/>
                 <w:sz w:val="17"/>
               </w:rPr>
-              <w:t>SEBIA 5, 1,5 u per podoloog in het eigen centrum, door Dobbels, vóór de paasvakantie en bij voorkeur vóór de eerste maand 3-visite. Optie B: vanaf 12 april. Beste moment: Kortrijk wo, Brugge ma VM, Antwerpen di of wo VM, Aalst di; Gent en Leuven nog op te vragen</w:t>
+              <w:t>SEBIA 5, 1,5 u per podoloog in het eigen centrum, door Dobbels, na SEBIA 3 en 4, vóór de paasvakantie en bij voorkeur vóór de eerste maand 3-visite. Optie B: vanaf 12 april. Beste moment: Kortrijk wo, Brugge ma VM, Antwerpen di of wo VM, Aalst di; Gent en Leuven nog op te vragen</w:t>
             </w:r>
           </w:p>
         </w:tc>
@@ -3647,7 +3647,7 @@
                 <w:color w:val="1B2630"/>
                 <w:sz w:val="17"/>
               </w:rPr>
-              <w:t>maand 6–9 na de start</w:t>
+              <w:t>sep–dec 2027</w:t>
             </w:r>
           </w:p>
         </w:tc>
@@ -3667,7 +3667,7 @@
                 <w:color w:val="1B2630"/>
                 <w:sz w:val="17"/>
               </w:rPr>
-              <w:t>SEBIA 6, intervisie met feedback, 1 u per podoloog, online, door Dobbels</w:t>
+              <w:t>SEBIA 6, intervisie met feedback, 1 u per podoloog, online, door Dobbels, op maand 6–9 na de start van de inclusie (bij een start begin maart)</w:t>
             </w:r>
           </w:p>
         </w:tc>
@@ -7439,7 +7439,7 @@
                 <w:color w:val="1B2630"/>
                 <w:sz w:val="17"/>
               </w:rPr>
-              <w:t>in maart, vóór de paasvakantie</w:t>
+              <w:t>15 tot 26 maart, na SEBIA 3 en 4</w:t>
             </w:r>
           </w:p>
         </w:tc>

</xml_diff>

<commit_message>
SEBIA 6 naar sep-nov 2027: inclusie start eind februari, meteen na de Go/No-Go
Co-Authored-By: Claude Opus 5.5 <noreply@anthropic.com>
</commit_message>
<xml_diff>
--- a/Educatie/PARADISE_opleidingsplanning.docx
+++ b/Educatie/PARADISE_opleidingsplanning.docx
@@ -3647,7 +3647,7 @@
                 <w:color w:val="1B2630"/>
                 <w:sz w:val="17"/>
               </w:rPr>
-              <w:t>sep–dec 2027</w:t>
+              <w:t>sep–nov 2027</w:t>
             </w:r>
           </w:p>
         </w:tc>
@@ -3667,7 +3667,7 @@
                 <w:color w:val="1B2630"/>
                 <w:sz w:val="17"/>
               </w:rPr>
-              <w:t>SEBIA 6, intervisie met feedback, 1 u per podoloog, online, door Dobbels, op maand 6–9 na de start van de inclusie (bij een start begin maart)</w:t>
+              <w:t>SEBIA 6, intervisie met feedback, 1 u per podoloog, online, door Dobbels, op maand 6–9 na de start van de inclusie (start eind februari, meteen na de Go/No-Go)</w:t>
             </w:r>
           </w:p>
         </w:tc>

</xml_diff>

<commit_message>
Opleiding: voorstel voor elk open punt (SEBIA 1-2 Brugge ma 14 dec, technologie UZA wo 20 jan, droogloop Kortrijk wo 13 jan, inhaalslots)
Inhaal Kortrijk ma 25 jan VM en Brugge ma 25 jan NM, Antwerpen di 2 feb VM; SEBIA 3-4 groep Oost in het UZA op hun vraag; vier groepen voor SEBIA 1-2 in belasting en lesuren.

Co-Authored-By: Claude Opus 5.5 <noreply@anthropic.com>
</commit_message>
<xml_diff>
--- a/Educatie/PARADISE_opleidingsplanning.docx
+++ b/Educatie/PARADISE_opleidingsplanning.docx
@@ -716,7 +716,7 @@
                 <w:color w:val="1B2630"/>
                 <w:sz w:val="17"/>
               </w:rPr>
-              <w:t>drie groepen; Gent in het eigen centrum</w:t>
+              <w:t>vier groepen; Gent en Brugge in het eigen centrum</w:t>
             </w:r>
           </w:p>
         </w:tc>
@@ -1675,7 +1675,7 @@
           <w:color w:val="00407A"/>
           <w:sz w:val="19"/>
         </w:rPr>
-        <w:t>December · technologie per centrum; gezondheidseconomie en procesevaluatie online; SEBIA 1 en 2 voor Kortrijk</w:t>
+        <w:t>December · technologie per centrum; gezondheidseconomie en procesevaluatie online; SEBIA 1 en 2 voor Brugge en Kortrijk</w:t>
       </w:r>
     </w:p>
     <w:tbl>
@@ -2051,6 +2051,71 @@
                 <w:color w:val="1B2630"/>
                 <w:sz w:val="17"/>
               </w:rPr>
+              <w:t>ma 14 dec</w:t>
+            </w:r>
+          </w:p>
+        </w:tc>
+        <w:tc>
+          <w:tcPr>
+            <w:tcW w:type="dxa" w:w="4400"/>
+          </w:tcPr>
+          <w:p>
+            <w:pPr>
+              <w:spacing w:before="40" w:after="40"/>
+            </w:pPr>
+            <w:r/>
+            <w:r>
+              <w:rPr>
+                <w:rFonts w:ascii="Segoe UI" w:hAnsi="Segoe UI"/>
+                <w:b w:val="0"/>
+                <w:color w:val="1B2630"/>
+                <w:sz w:val="17"/>
+              </w:rPr>
+              <w:t>SEBIA 1 en 2, Brugge, 9u–13u, beide verpleegkundigen (voorstel)</w:t>
+            </w:r>
+          </w:p>
+        </w:tc>
+        <w:tc>
+          <w:tcPr>
+            <w:tcW w:type="dxa" w:w="3560"/>
+          </w:tcPr>
+          <w:p>
+            <w:pPr>
+              <w:spacing w:before="40" w:after="40"/>
+            </w:pPr>
+            <w:r/>
+            <w:r>
+              <w:rPr>
+                <w:rFonts w:ascii="Segoe UI" w:hAnsi="Segoe UI"/>
+                <w:b w:val="0"/>
+                <w:color w:val="1B2630"/>
+                <w:sz w:val="17"/>
+              </w:rPr>
+              <w:t>AZ Sint-Jan Brugge</w:t>
+            </w:r>
+          </w:p>
+        </w:tc>
+      </w:tr>
+      <w:tr>
+        <w:trPr>
+          <w:cantSplit/>
+        </w:trPr>
+        <w:tc>
+          <w:tcPr>
+            <w:tcW w:type="dxa" w:w="1900"/>
+          </w:tcPr>
+          <w:p>
+            <w:pPr>
+              <w:spacing w:before="40" w:after="40"/>
+            </w:pPr>
+            <w:r/>
+            <w:r>
+              <w:rPr>
+                <w:rFonts w:ascii="Segoe UI" w:hAnsi="Segoe UI"/>
+                <w:b/>
+                <w:color w:val="1B2630"/>
+                <w:sz w:val="17"/>
+              </w:rPr>
               <w:t>di 15 dec</w:t>
             </w:r>
           </w:p>
@@ -2259,7 +2324,7 @@
           <w:color w:val="00407A"/>
           <w:sz w:val="19"/>
         </w:rPr>
-        <w:t>Januari · zelftest, SEBIA 1 en 2, datacollectie, dan de zes drooglopen</w:t>
+        <w:t>Januari · zelftest, SEBIA 1 en 2, datacollectie, technologie Antwerpen, dan de zes drooglopen</w:t>
       </w:r>
     </w:p>
     <w:tbl>
@@ -2440,71 +2505,6 @@
                 <w:color w:val="1B2630"/>
                 <w:sz w:val="17"/>
               </w:rPr>
-              <w:t>januari</w:t>
-            </w:r>
-          </w:p>
-        </w:tc>
-        <w:tc>
-          <w:tcPr>
-            <w:tcW w:type="dxa" w:w="4700"/>
-          </w:tcPr>
-          <w:p>
-            <w:pPr>
-              <w:spacing w:before="40" w:after="40"/>
-            </w:pPr>
-            <w:r/>
-            <w:r>
-              <w:rPr>
-                <w:rFonts w:ascii="Segoe UI" w:hAnsi="Segoe UI"/>
-                <w:b w:val="0"/>
-                <w:color w:val="1B2630"/>
-                <w:sz w:val="17"/>
-              </w:rPr>
-              <w:t>Technologie, datum af te spreken: de podoloog is pas in januari terug; vóór de droogloop van wo 27 jan</w:t>
-            </w:r>
-          </w:p>
-        </w:tc>
-        <w:tc>
-          <w:tcPr>
-            <w:tcW w:type="dxa" w:w="3260"/>
-          </w:tcPr>
-          <w:p>
-            <w:pPr>
-              <w:spacing w:before="40" w:after="40"/>
-            </w:pPr>
-            <w:r/>
-            <w:r>
-              <w:rPr>
-                <w:rFonts w:ascii="Segoe UI" w:hAnsi="Segoe UI"/>
-                <w:b w:val="0"/>
-                <w:color w:val="1B2630"/>
-                <w:sz w:val="17"/>
-              </w:rPr>
-              <w:t>UZ Antwerpen</w:t>
-            </w:r>
-          </w:p>
-        </w:tc>
-      </w:tr>
-      <w:tr>
-        <w:trPr>
-          <w:cantSplit/>
-        </w:trPr>
-        <w:tc>
-          <w:tcPr>
-            <w:tcW w:type="dxa" w:w="1900"/>
-          </w:tcPr>
-          <w:p>
-            <w:pPr>
-              <w:spacing w:before="40" w:after="40"/>
-            </w:pPr>
-            <w:r/>
-            <w:r>
-              <w:rPr>
-                <w:rFonts w:ascii="Segoe UI" w:hAnsi="Segoe UI"/>
-                <w:b/>
-                <w:color w:val="1B2630"/>
-                <w:sz w:val="17"/>
-              </w:rPr>
               <w:t>vr 8 jan</w:t>
             </w:r>
           </w:p>
@@ -2655,7 +2655,7 @@
                 <w:color w:val="1B2630"/>
                 <w:sz w:val="17"/>
               </w:rPr>
-              <w:t>SEBIA 1 en 2, groep Oost (Antwerpen, Leuven, Aalst), 13u–17u. Antwerpen vraagt alle SEBIA-sessies in het UZA of online</w:t>
+              <w:t>SEBIA 1 en 2, groep Oost (Antwerpen, Leuven, Aalst), 13u–17u. Antwerpen vraagt SEBIA in het UZA: voorstel SEBIA 3 en 4 daar</w:t>
             </w:r>
           </w:p>
         </w:tc>
@@ -2676,6 +2676,71 @@
                 <w:sz w:val="17"/>
               </w:rPr>
               <w:t>centraal, voorstel Leuven</w:t>
+            </w:r>
+          </w:p>
+        </w:tc>
+      </w:tr>
+      <w:tr>
+        <w:trPr>
+          <w:cantSplit/>
+        </w:trPr>
+        <w:tc>
+          <w:tcPr>
+            <w:tcW w:type="dxa" w:w="1900"/>
+          </w:tcPr>
+          <w:p>
+            <w:pPr>
+              <w:spacing w:before="40" w:after="40"/>
+            </w:pPr>
+            <w:r/>
+            <w:r>
+              <w:rPr>
+                <w:rFonts w:ascii="Segoe UI" w:hAnsi="Segoe UI"/>
+                <w:b/>
+                <w:color w:val="1B2630"/>
+                <w:sz w:val="17"/>
+              </w:rPr>
+              <w:t>wo 13 jan</w:t>
+            </w:r>
+          </w:p>
+        </w:tc>
+        <w:tc>
+          <w:tcPr>
+            <w:tcW w:type="dxa" w:w="4700"/>
+          </w:tcPr>
+          <w:p>
+            <w:pPr>
+              <w:spacing w:before="40" w:after="40"/>
+            </w:pPr>
+            <w:r/>
+            <w:r>
+              <w:rPr>
+                <w:rFonts w:ascii="Segoe UI" w:hAnsi="Segoe UI"/>
+                <w:b w:val="0"/>
+                <w:color w:val="1B2630"/>
+                <w:sz w:val="17"/>
+              </w:rPr>
+              <w:t>Droogloop en debriefing (voorstel; wo 20 jan past niet)</w:t>
+            </w:r>
+          </w:p>
+        </w:tc>
+        <w:tc>
+          <w:tcPr>
+            <w:tcW w:type="dxa" w:w="3260"/>
+          </w:tcPr>
+          <w:p>
+            <w:pPr>
+              <w:spacing w:before="40" w:after="40"/>
+            </w:pPr>
+            <w:r/>
+            <w:r>
+              <w:rPr>
+                <w:rFonts w:ascii="Segoe UI" w:hAnsi="Segoe UI"/>
+                <w:b w:val="0"/>
+                <w:color w:val="1B2630"/>
+                <w:sz w:val="17"/>
+              </w:rPr>
+              <w:t>AZ Groeninge Kortrijk</w:t>
             </w:r>
           </w:p>
         </w:tc>
@@ -2895,6 +2960,71 @@
                 <w:color w:val="1B2630"/>
                 <w:sz w:val="17"/>
               </w:rPr>
+              <w:t>wo 20 jan</w:t>
+            </w:r>
+          </w:p>
+        </w:tc>
+        <w:tc>
+          <w:tcPr>
+            <w:tcW w:type="dxa" w:w="4700"/>
+          </w:tcPr>
+          <w:p>
+            <w:pPr>
+              <w:spacing w:before="40" w:after="40"/>
+            </w:pPr>
+            <w:r/>
+            <w:r>
+              <w:rPr>
+                <w:rFonts w:ascii="Segoe UI" w:hAnsi="Segoe UI"/>
+                <w:b w:val="0"/>
+                <w:color w:val="1B2630"/>
+                <w:sz w:val="17"/>
+              </w:rPr>
+              <w:t>Technologie, voormiddag (voorstel; de podoloog is pas in januari terug)</w:t>
+            </w:r>
+          </w:p>
+        </w:tc>
+        <w:tc>
+          <w:tcPr>
+            <w:tcW w:type="dxa" w:w="3260"/>
+          </w:tcPr>
+          <w:p>
+            <w:pPr>
+              <w:spacing w:before="40" w:after="40"/>
+            </w:pPr>
+            <w:r/>
+            <w:r>
+              <w:rPr>
+                <w:rFonts w:ascii="Segoe UI" w:hAnsi="Segoe UI"/>
+                <w:b w:val="0"/>
+                <w:color w:val="1B2630"/>
+                <w:sz w:val="17"/>
+              </w:rPr>
+              <w:t>UZ Antwerpen</w:t>
+            </w:r>
+          </w:p>
+        </w:tc>
+      </w:tr>
+      <w:tr>
+        <w:trPr>
+          <w:cantSplit/>
+        </w:trPr>
+        <w:tc>
+          <w:tcPr>
+            <w:tcW w:type="dxa" w:w="1900"/>
+          </w:tcPr>
+          <w:p>
+            <w:pPr>
+              <w:spacing w:before="40" w:after="40"/>
+            </w:pPr>
+            <w:r/>
+            <w:r>
+              <w:rPr>
+                <w:rFonts w:ascii="Segoe UI" w:hAnsi="Segoe UI"/>
+                <w:b/>
+                <w:color w:val="1B2630"/>
+                <w:sz w:val="17"/>
+              </w:rPr>
               <w:t>do 21 jan</w:t>
             </w:r>
           </w:p>
@@ -2936,71 +3066,6 @@
                 <w:sz w:val="17"/>
               </w:rPr>
               <w:t>UZ Gent</w:t>
-            </w:r>
-          </w:p>
-        </w:tc>
-      </w:tr>
-      <w:tr>
-        <w:trPr>
-          <w:cantSplit/>
-        </w:trPr>
-        <w:tc>
-          <w:tcPr>
-            <w:tcW w:type="dxa" w:w="1900"/>
-          </w:tcPr>
-          <w:p>
-            <w:pPr>
-              <w:spacing w:before="40" w:after="40"/>
-            </w:pPr>
-            <w:r/>
-            <w:r>
-              <w:rPr>
-                <w:rFonts w:ascii="Segoe UI" w:hAnsi="Segoe UI"/>
-                <w:b/>
-                <w:color w:val="1B2630"/>
-                <w:sz w:val="17"/>
-              </w:rPr>
-              <w:t>ma 25 jan</w:t>
-            </w:r>
-          </w:p>
-        </w:tc>
-        <w:tc>
-          <w:tcPr>
-            <w:tcW w:type="dxa" w:w="4700"/>
-          </w:tcPr>
-          <w:p>
-            <w:pPr>
-              <w:spacing w:before="40" w:after="40"/>
-            </w:pPr>
-            <w:r/>
-            <w:r>
-              <w:rPr>
-                <w:rFonts w:ascii="Segoe UI" w:hAnsi="Segoe UI"/>
-                <w:b w:val="0"/>
-                <w:color w:val="1B2630"/>
-                <w:sz w:val="17"/>
-              </w:rPr>
-              <w:t>Droogloop en debriefing, voormiddag; wo 20 jan past niet (fiche 16 okt)</w:t>
-            </w:r>
-          </w:p>
-        </w:tc>
-        <w:tc>
-          <w:tcPr>
-            <w:tcW w:type="dxa" w:w="3260"/>
-          </w:tcPr>
-          <w:p>
-            <w:pPr>
-              <w:spacing w:before="40" w:after="40"/>
-            </w:pPr>
-            <w:r/>
-            <w:r>
-              <w:rPr>
-                <w:rFonts w:ascii="Segoe UI" w:hAnsi="Segoe UI"/>
-                <w:b w:val="0"/>
-                <w:color w:val="1B2630"/>
-                <w:sz w:val="17"/>
-              </w:rPr>
-              <w:t>AZ Groeninge Kortrijk</w:t>
             </w:r>
           </w:p>
         </w:tc>
@@ -3153,7 +3218,7 @@
           <w:color w:val="5A6A78"/>
           <w:sz w:val="17"/>
         </w:rPr>
-        <w:t>Inhaalslots: do 21 jan NM (Aalst), vr 22 jan (Leuven VM, bevestigd; Gent NM), do 28 jan VM (Gent). Nog te zoeken: Kortrijk, want de droogloop neemt het inhaalslot van ma 25 jan in; Brugge, want het inhaalslot wo 13 jan valt op een woensdag, en die kan Sint-Jan niet; Antwerpen, want do 28 jan past niet.</w:t>
+        <w:t>Inhaalslots: do 21 jan NM (Aalst), vr 22 jan (Leuven VM, bevestigd; Gent NM), ma 25 jan VM (Kortrijk, zoals gevraagd op 20 okt) en NM (Brugge, voorstel), do 28 jan VM (Gent), di 2 feb VM (Antwerpen, voorstel: do 28 jan past niet en na 27 jan is er geen andere dag vóór de piloot; hun pilootbezoeken vallen dan in de tweede reeks, 15–19 feb).</w:t>
       </w:r>
     </w:p>
     <w:p>
@@ -3597,7 +3662,7 @@
                 <w:color w:val="1B2630"/>
                 <w:sz w:val="17"/>
               </w:rPr>
-              <w:t>SEBIA 3 en 4, Kortrijk en Brugge, namiddag, plaats volgt</w:t>
+              <w:t>SEBIA 3 en 4, Kortrijk en Brugge (beide verpleegkundigen), namiddag, plaats volgt</w:t>
             </w:r>
           </w:p>
         </w:tc>
@@ -3642,7 +3707,7 @@
                 <w:color w:val="1B2630"/>
                 <w:sz w:val="17"/>
               </w:rPr>
-              <w:t>SEBIA 3 en 4, groep Oost, namiddag, centraal, voorstel Leuven</w:t>
+              <w:t>SEBIA 3 en 4, groep Oost, namiddag, voorstel UZ Antwerpen, op hun vraag (SEBIA 1 en 2 is in Leuven)</w:t>
             </w:r>
           </w:p>
         </w:tc>
@@ -5623,7 +5688,7 @@
                 <w:color w:val="1B2630"/>
                 <w:sz w:val="17"/>
               </w:rPr>
-              <w:t>Janou: 5 dagen technologie, 6 dagen droogloop, 6 dagen SEBIA, plus de piloot · Dobbels: 6 groepssessies, één inhaalmoment en SEBIA 5 in de zes centra, op vijf dagen</w:t>
+              <w:t>Janou: 5 dagen technologie, 6 dagen droogloop, 7 dagen SEBIA, plus de piloot · Dobbels: 7 groepssessies, één inhaalmoment en SEBIA 5 in de zes centra, op vijf dagen</w:t>
             </w:r>
           </w:p>
         </w:tc>
@@ -6031,7 +6096,7 @@
                 <w:color w:val="1B2630"/>
                 <w:sz w:val="17"/>
               </w:rPr>
-              <w:t>SEBIA 1 en 2, drie groepen</w:t>
+              <w:t>SEBIA 1 en 2, vier groepen</w:t>
             </w:r>
           </w:p>
         </w:tc>
@@ -6071,7 +6136,7 @@
                 <w:color w:val="1B2630"/>
                 <w:sz w:val="17"/>
               </w:rPr>
-              <w:t>12 u</w:t>
+              <w:t>16 u</w:t>
             </w:r>
           </w:p>
         </w:tc>
@@ -6200,7 +6265,7 @@
                 <w:color w:val="1B2630"/>
                 <w:sz w:val="17"/>
               </w:rPr>
-              <w:t>57,5 u</w:t>
+              <w:t>61,5 u</w:t>
             </w:r>
           </w:p>
         </w:tc>
@@ -6692,7 +6757,7 @@
           <w:color w:val="1B2630"/>
           <w:sz w:val="19"/>
         </w:rPr>
-        <w:t xml:space="preserve">  woensdag kan niet en di 12 jan past niet (fiche 21 okt), en de verantwoordelijke verpleegkundige is in januari 2027 afwezig. Sint-Jan houdt de maandag vrij voor de studie; in december is ma 14 dec de enige maandag tussen de gewone dagen van Dobbels. Af te spreken met Dobbels en Sint-Jan, ook voor de back-up, voor wie ook di 2 mrt (SEBIA 3 en 4) niet past.</w:t>
+        <w:t xml:space="preserve">  voorstel ma 14 dec, 9u–13u, in AZ Sint-Jan, voor beide verpleegkundigen. Woensdag en di 12 jan passen niet en de verantwoordelijke verpleegkundige is in januari 2027 afwezig; ma 14 dec is in december de enige maandag tussen de gewone dagen van Dobbels, en Sint-Jan houdt de maandag vrij voor de studie. SEBIA 3 en 4: beiden op ma 1 mrt NM, met Kortrijk, want di 2 mrt past niet. Te bevestigen door Dobbels en Sint-Jan.</w:t>
       </w:r>
     </w:p>
     <w:p>
@@ -6725,7 +6790,7 @@
           <w:color w:val="1B2630"/>
           <w:sz w:val="19"/>
         </w:rPr>
-        <w:t xml:space="preserve">  de podoloog is pas in januari 2027 terug, dus niet op wo 9 dec. Een dag in januari vóór de droogloop van wo 27 jan, op dinsdag, woensdag of donderdag in een even week. Antwerpen vraagt ook alle SEBIA-sessies in het UZA of online.</w:t>
+        <w:t xml:space="preserve">  voorstel wo 20 jan VM. De podoloog is pas in januari terug, dus zo laat mogelijk en toch een week vóór de droogloop van wo 27 jan; hun voetkliniek is pas 's namiddags. SEBIA vraagt aanwezigheid, dus niet online: voorstel SEBIA 3 en 4 voor groep Oost in het UZA (di 2 mrt); SEBIA 1 en 2 blijft in Leuven, SEBIA 5 is al in het UZA en SEBIA 6 is online. Te bevestigen door Antwerpen, ook voor Leuven en Aalst.</w:t>
       </w:r>
     </w:p>
     <w:p>
@@ -6749,7 +6814,7 @@
           <w:color w:val="1B2630"/>
           <w:sz w:val="19"/>
         </w:rPr>
-        <w:t>Nieuwe inhaalslots voor de droogloop:</w:t>
+        <w:t>Droogloop en inhaal:</w:t>
       </w:r>
       <w:r>
         <w:rPr>
@@ -6758,7 +6823,7 @@
           <w:color w:val="1B2630"/>
           <w:sz w:val="19"/>
         </w:rPr>
-        <w:t xml:space="preserve">  Kortrijk, Brugge en Antwerpen (sectie 2, januari).</w:t>
+        <w:t xml:space="preserve">  Kortrijk: voorstel droogloop wo 13 jan, omdat wo 20 jan niet past en die woensdag vrij is sinds Brugge naar ma 18 jan schoof, met ma 25 jan VM als inhaal, zoals Kortrijk op 20 okt vroeg. Brugge: inhaal ma 25 jan NM, de enige maandag na hun droogloop en vóór de piloot. Antwerpen: inhaal di 2 feb VM, met hun pilootbezoeken in de tweede reeks. Te bevestigen door de drie centra.</w:t>
       </w:r>
     </w:p>
     <w:p>

</xml_diff>